<commit_message>
Refine A1 certificate template
</commit_message>
<xml_diff>
--- a/public/certificate-templates/VDI2168_A1_Teilnahmebestaetigung.docx
+++ b/public/certificate-templates/VDI2168_A1_Teilnahmebestaetigung.docx
@@ -72,84 +72,6 @@
       </w:pPr>
       <w:r>
         <w:rPr>
-          <w:rFonts w:ascii="Arial" w:eastAsia="Times New Roman" w:hAnsi="Arial" w:cs="Arial"/>
-          <w:b/>
-          <w:noProof/>
-          <w:color w:val="000000"/>
-          <w:kern w:val="0"/>
-          <w:sz w:val="40"/>
-          <w:lang w:eastAsia="de-DE"/>
-          <w14:ligatures w14:val="none"/>
-        </w:rPr>
-        <w:fldChar w:fldCharType="begin"/>
-      </w:r>
-      <w:r>
-        <w:rPr>
-          <w:rFonts w:ascii="Arial" w:eastAsia="Times New Roman" w:hAnsi="Arial" w:cs="Arial"/>
-          <w:b/>
-          <w:noProof/>
-          <w:color w:val="000000"/>
-          <w:kern w:val="0"/>
-          <w:sz w:val="40"/>
-          <w:lang w:eastAsia="de-DE"/>
-          <w14:ligatures w14:val="none"/>
-        </w:rPr>
-        <w:instrText xml:space="preserve"> MERGEFIELD Vorname </w:instrText>
-      </w:r>
-      <w:r>
-        <w:rPr>
-          <w:rFonts w:ascii="Arial" w:eastAsia="Times New Roman" w:hAnsi="Arial" w:cs="Arial"/>
-          <w:b/>
-          <w:noProof/>
-          <w:color w:val="000000"/>
-          <w:kern w:val="0"/>
-          <w:sz w:val="40"/>
-          <w:lang w:eastAsia="de-DE"/>
-          <w14:ligatures w14:val="none"/>
-        </w:rPr>
-        <w:fldChar w:fldCharType="separate"/>
-      </w:r>
-      <w:r>
-        <w:rPr>
-          <w:rFonts w:ascii="Arial" w:eastAsia="Times New Roman" w:hAnsi="Arial" w:cs="Arial"/>
-          <w:b/>
-          <w:noProof/>
-          <w:color w:val="000000"/>
-          <w:kern w:val="0"/>
-          <w:sz w:val="40"/>
-          <w:lang w:eastAsia="de-DE"/>
-          <w14:ligatures w14:val="none"/>
-        </w:rPr>
-        <w:t>«Vorname»</w:t>
-      </w:r>
-      <w:r>
-        <w:rPr>
-          <w:rFonts w:ascii="Arial" w:eastAsia="Times New Roman" w:hAnsi="Arial" w:cs="Arial"/>
-          <w:b/>
-          <w:noProof/>
-          <w:color w:val="000000"/>
-          <w:kern w:val="0"/>
-          <w:sz w:val="40"/>
-          <w:lang w:eastAsia="de-DE"/>
-          <w14:ligatures w14:val="none"/>
-        </w:rPr>
-        <w:fldChar w:fldCharType="end"/>
-      </w:r>
-      <w:r>
-        <w:rPr>
-          <w:rFonts w:ascii="Arial" w:eastAsia="Times New Roman" w:hAnsi="Arial" w:cs="Arial"/>
-          <w:b/>
-          <w:noProof/>
-          <w:color w:val="000000"/>
-          <w:kern w:val="0"/>
-          <w:sz w:val="40"/>
-          <w:lang w:eastAsia="de-DE"/>
-          <w14:ligatures w14:val="none"/>
-        </w:rPr>
-        <w:t xml:space="preserve"> </w:t>
-      </w:r>
-      <w:r>
-        <w:rPr>
           <w:rFonts w:ascii="Arial" w:eastAsia="Times New Roman" w:hAnsi="Arial" w:cs="Calibri"/>
           <w:b/>
           <w:noProof/>
@@ -159,7 +81,7 @@
           <w:lang w:eastAsia="de-DE"/>
           <w14:ligatures w14:val="none"/>
         </w:rPr>
-        <w:fldChar w:fldCharType="begin"/>
+        <w:t>{firstName}</w:t>
       </w:r>
       <w:r>
         <w:rPr>
@@ -172,7 +94,7 @@
           <w:lang w:eastAsia="de-DE"/>
           <w14:ligatures w14:val="none"/>
         </w:rPr>
-        <w:instrText xml:space="preserve"> MERGEFIELD Nachname </w:instrText>
+        <w:t xml:space="preserve"> </w:t>
       </w:r>
       <w:r>
         <w:rPr>
@@ -185,33 +107,7 @@
           <w:lang w:eastAsia="de-DE"/>
           <w14:ligatures w14:val="none"/>
         </w:rPr>
-        <w:fldChar w:fldCharType="separate"/>
-      </w:r>
-      <w:r>
-        <w:rPr>
-          <w:rFonts w:ascii="Arial" w:eastAsia="Times New Roman" w:hAnsi="Arial" w:cs="Calibri"/>
-          <w:b/>
-          <w:noProof/>
-          <w:color w:val="000000"/>
-          <w:kern w:val="0"/>
-          <w:sz w:val="40"/>
-          <w:lang w:eastAsia="de-DE"/>
-          <w14:ligatures w14:val="none"/>
-        </w:rPr>
-        <w:t>«Nachname»</w:t>
-      </w:r>
-      <w:r>
-        <w:rPr>
-          <w:rFonts w:ascii="Arial" w:eastAsia="Times New Roman" w:hAnsi="Arial" w:cs="Calibri"/>
-          <w:b/>
-          <w:noProof/>
-          <w:color w:val="000000"/>
-          <w:kern w:val="0"/>
-          <w:sz w:val="40"/>
-          <w:lang w:eastAsia="de-DE"/>
-          <w14:ligatures w14:val="none"/>
-        </w:rPr>
-        <w:fldChar w:fldCharType="end"/>
+        <w:t>{lastName}</w:t>
       </w:r>
     </w:p>
     <w:p>
@@ -251,50 +147,23 @@
           <w:b/>
           <w:bCs/>
         </w:rPr>
-        <w:fldChar w:fldCharType="begin"/>
-      </w:r>
+        <w:t>{</w:t>
+      </w:r>
+      <w:proofErr w:type="spellStart"/>
       <w:r>
         <w:rPr>
           <w:b/>
           <w:bCs/>
         </w:rPr>
-        <w:instrText xml:space="preserve"> MERGEFIELD Geburtstag</w:instrText>
-      </w:r>
+        <w:t>birthDate</w:t>
+      </w:r>
+      <w:proofErr w:type="spellEnd"/>
       <w:r>
         <w:rPr>
           <w:b/>
           <w:bCs/>
         </w:rPr>
-        <w:instrText xml:space="preserve"> </w:instrText>
-      </w:r>
-      <w:r>
-        <w:rPr>
-          <w:b/>
-          <w:bCs/>
-        </w:rPr>
-        <w:instrText xml:space="preserve">\@ "dd.MM.yyyy" </w:instrText>
-      </w:r>
-      <w:r>
-        <w:rPr>
-          <w:b/>
-          <w:bCs/>
-        </w:rPr>
-        <w:fldChar w:fldCharType="separate"/>
-      </w:r>
-      <w:r>
-        <w:rPr>
-          <w:b/>
-          <w:bCs/>
-          <w:noProof/>
-        </w:rPr>
-        <w:t>«Geburtstag»</w:t>
-      </w:r>
-      <w:r>
-        <w:rPr>
-          <w:b/>
-          <w:bCs/>
-        </w:rPr>
-        <w:fldChar w:fldCharType="end"/>
+        <w:t>}</w:t>
       </w:r>
     </w:p>
     <w:p>
@@ -350,7 +219,7 @@
           <w:lang w:eastAsia="de-DE"/>
           <w14:ligatures w14:val="none"/>
         </w:rPr>
-        <w:t>vom</w:t>
+        <w:t>im Zeitraum</w:t>
       </w:r>
       <w:r>
         <w:rPr>
@@ -370,7 +239,7 @@
           <w:lang w:eastAsia="de-DE"/>
           <w14:ligatures w14:val="none"/>
         </w:rPr>
-        <w:t>05</w:t>
+        <w:t>{trainingPeriod}</w:t>
       </w:r>
       <w:r>
         <w:rPr>
@@ -380,7 +249,7 @@
           <w:lang w:eastAsia="de-DE"/>
           <w14:ligatures w14:val="none"/>
         </w:rPr>
-        <w:t>.</w:t>
+        <w:t xml:space="preserve"> </w:t>
       </w:r>
       <w:r>
         <w:rPr>
@@ -390,7 +259,7 @@
           <w:lang w:eastAsia="de-DE"/>
           <w14:ligatures w14:val="none"/>
         </w:rPr>
-        <w:t>0</w:t>
+        <w:t xml:space="preserve">in </w:t>
       </w:r>
       <w:r>
         <w:rPr>
@@ -400,117 +269,7 @@
           <w:lang w:eastAsia="de-DE"/>
           <w14:ligatures w14:val="none"/>
         </w:rPr>
-        <w:t>5</w:t>
-      </w:r>
-      <w:r>
-        <w:rPr>
-          <w:rFonts w:ascii="Arial" w:eastAsia="Times New Roman" w:hAnsi="Arial" w:cs="Arial"/>
-          <w:noProof/>
-          <w:kern w:val="0"/>
-          <w:lang w:eastAsia="de-DE"/>
-          <w14:ligatures w14:val="none"/>
-        </w:rPr>
-        <w:t>.202</w:t>
-      </w:r>
-      <w:r>
-        <w:rPr>
-          <w:rFonts w:ascii="Arial" w:eastAsia="Times New Roman" w:hAnsi="Arial" w:cs="Arial"/>
-          <w:noProof/>
-          <w:kern w:val="0"/>
-          <w:lang w:eastAsia="de-DE"/>
-          <w14:ligatures w14:val="none"/>
-        </w:rPr>
-        <w:t>6</w:t>
-      </w:r>
-      <w:r>
-        <w:rPr>
-          <w:rFonts w:ascii="Arial" w:eastAsia="Times New Roman" w:hAnsi="Arial" w:cs="Arial"/>
-          <w:noProof/>
-          <w:kern w:val="0"/>
-          <w:lang w:eastAsia="de-DE"/>
-          <w14:ligatures w14:val="none"/>
-        </w:rPr>
-        <w:t xml:space="preserve"> bis </w:t>
-      </w:r>
-      <w:r>
-        <w:rPr>
-          <w:rFonts w:ascii="Arial" w:eastAsia="Times New Roman" w:hAnsi="Arial" w:cs="Arial"/>
-          <w:noProof/>
-          <w:kern w:val="0"/>
-          <w:lang w:eastAsia="de-DE"/>
-          <w14:ligatures w14:val="none"/>
-        </w:rPr>
-        <w:t>07</w:t>
-      </w:r>
-      <w:r>
-        <w:rPr>
-          <w:rFonts w:ascii="Arial" w:eastAsia="Times New Roman" w:hAnsi="Arial" w:cs="Arial"/>
-          <w:noProof/>
-          <w:kern w:val="0"/>
-          <w:lang w:eastAsia="de-DE"/>
-          <w14:ligatures w14:val="none"/>
-        </w:rPr>
-        <w:t>.</w:t>
-      </w:r>
-      <w:r>
-        <w:rPr>
-          <w:rFonts w:ascii="Arial" w:eastAsia="Times New Roman" w:hAnsi="Arial" w:cs="Arial"/>
-          <w:noProof/>
-          <w:kern w:val="0"/>
-          <w:lang w:eastAsia="de-DE"/>
-          <w14:ligatures w14:val="none"/>
-        </w:rPr>
-        <w:t>0</w:t>
-      </w:r>
-      <w:r>
-        <w:rPr>
-          <w:rFonts w:ascii="Arial" w:eastAsia="Times New Roman" w:hAnsi="Arial" w:cs="Arial"/>
-          <w:noProof/>
-          <w:kern w:val="0"/>
-          <w:lang w:eastAsia="de-DE"/>
-          <w14:ligatures w14:val="none"/>
-        </w:rPr>
-        <w:t>5</w:t>
-      </w:r>
-      <w:r>
-        <w:rPr>
-          <w:rFonts w:ascii="Arial" w:eastAsia="Times New Roman" w:hAnsi="Arial" w:cs="Arial"/>
-          <w:noProof/>
-          <w:kern w:val="0"/>
-          <w:lang w:eastAsia="de-DE"/>
-          <w14:ligatures w14:val="none"/>
-        </w:rPr>
-        <w:t>.202</w:t>
-      </w:r>
-      <w:r>
-        <w:rPr>
-          <w:rFonts w:ascii="Arial" w:eastAsia="Times New Roman" w:hAnsi="Arial" w:cs="Arial"/>
-          <w:noProof/>
-          <w:kern w:val="0"/>
-          <w:lang w:eastAsia="de-DE"/>
-          <w14:ligatures w14:val="none"/>
-        </w:rPr>
-        <w:t>6</w:t>
-      </w:r>
-      <w:r>
-        <w:rPr>
-          <w:rFonts w:ascii="Arial" w:eastAsia="Times New Roman" w:hAnsi="Arial" w:cs="Arial"/>
-          <w:noProof/>
-          <w:kern w:val="0"/>
-          <w:lang w:eastAsia="de-DE"/>
-          <w14:ligatures w14:val="none"/>
-        </w:rPr>
-        <w:t xml:space="preserve"> in </w:t>
-      </w:r>
-      <w:r>
-        <w:rPr>
-          <w:rFonts w:ascii="Arial" w:eastAsia="Times New Roman" w:hAnsi="Arial" w:cs="Arial"/>
-          <w:noProof/>
-          <w:kern w:val="0"/>
-          <w:lang w:eastAsia="de-DE"/>
-          <w14:ligatures w14:val="none"/>
-        </w:rPr>
-        <w:t>Kiedrich</w:t>
+        <w:t>{location}</w:t>
       </w:r>
     </w:p>
     <w:p>
@@ -927,8 +686,8 @@
         <w:autoSpaceDE w:val="0"/>
         <w:autoSpaceDN w:val="0"/>
         <w:adjustRightInd w:val="0"/>
-        <w:spacing w:after="0" w:line="360" w:lineRule="auto"/>
-        <w:ind w:right="-574"/>
+        <w:spacing w:after="0" w:line="240" w:lineRule="auto"/>
+        <w:ind w:left="708" w:right="-574" w:firstLine="708"/>
         <w:rPr>
           <w:rFonts w:ascii="Calibri" w:eastAsia="Times New Roman" w:hAnsi="Calibri" w:cs="Calibri"/>
           <w:noProof/>
@@ -944,8 +703,225 @@
         <w:autoSpaceDE w:val="0"/>
         <w:autoSpaceDN w:val="0"/>
         <w:adjustRightInd w:val="0"/>
-        <w:spacing w:after="0" w:line="360" w:lineRule="auto"/>
-        <w:ind w:right="-574"/>
+        <w:spacing w:after="0" w:line="240" w:lineRule="auto"/>
+        <w:ind w:left="708" w:right="-574" w:firstLine="708"/>
+        <w:rPr>
+          <w:rFonts w:ascii="Calibri" w:eastAsia="Times New Roman" w:hAnsi="Calibri" w:cs="Calibri"/>
+          <w:noProof/>
+          <w:kern w:val="0"/>
+          <w:sz w:val="22"/>
+          <w:lang w:eastAsia="de-DE"/>
+          <w14:ligatures w14:val="none"/>
+        </w:rPr>
+      </w:pPr>
+    </w:p>
+    <w:p>
+      <w:pPr>
+        <w:autoSpaceDE w:val="0"/>
+        <w:autoSpaceDN w:val="0"/>
+        <w:adjustRightInd w:val="0"/>
+        <w:spacing w:after="0" w:line="240" w:lineRule="auto"/>
+        <w:ind w:left="708" w:right="-574" w:firstLine="708"/>
+        <w:rPr>
+          <w:rFonts w:ascii="Calibri" w:eastAsia="Times New Roman" w:hAnsi="Calibri" w:cs="Calibri"/>
+          <w:noProof/>
+          <w:kern w:val="0"/>
+          <w:sz w:val="22"/>
+          <w:lang w:eastAsia="de-DE"/>
+          <w14:ligatures w14:val="none"/>
+        </w:rPr>
+      </w:pPr>
+    </w:p>
+    <w:p>
+      <w:pPr>
+        <w:autoSpaceDE w:val="0"/>
+        <w:autoSpaceDN w:val="0"/>
+        <w:adjustRightInd w:val="0"/>
+        <w:spacing w:after="0" w:line="240" w:lineRule="auto"/>
+        <w:ind w:left="708" w:right="-574" w:firstLine="708"/>
+        <w:rPr>
+          <w:rFonts w:ascii="Calibri" w:eastAsia="Times New Roman" w:hAnsi="Calibri" w:cs="Calibri"/>
+          <w:noProof/>
+          <w:kern w:val="0"/>
+          <w:sz w:val="22"/>
+          <w:lang w:eastAsia="de-DE"/>
+          <w14:ligatures w14:val="none"/>
+        </w:rPr>
+      </w:pPr>
+    </w:p>
+    <w:p>
+      <w:pPr>
+        <w:autoSpaceDE w:val="0"/>
+        <w:autoSpaceDN w:val="0"/>
+        <w:adjustRightInd w:val="0"/>
+        <w:spacing w:after="0" w:line="240" w:lineRule="auto"/>
+        <w:ind w:left="708" w:right="-574" w:firstLine="708"/>
+        <w:rPr>
+          <w:rFonts w:ascii="Calibri" w:eastAsia="Times New Roman" w:hAnsi="Calibri" w:cs="Calibri"/>
+          <w:noProof/>
+          <w:kern w:val="0"/>
+          <w:sz w:val="22"/>
+          <w:lang w:eastAsia="de-DE"/>
+          <w14:ligatures w14:val="none"/>
+        </w:rPr>
+      </w:pPr>
+    </w:p>
+    <w:p>
+      <w:pPr>
+        <w:autoSpaceDE w:val="0"/>
+        <w:autoSpaceDN w:val="0"/>
+        <w:adjustRightInd w:val="0"/>
+        <w:spacing w:after="0" w:line="240" w:lineRule="auto"/>
+        <w:ind w:left="708" w:right="-574" w:firstLine="708"/>
+        <w:rPr>
+          <w:rFonts w:ascii="Calibri" w:eastAsia="Times New Roman" w:hAnsi="Calibri" w:cs="Calibri"/>
+          <w:noProof/>
+          <w:kern w:val="0"/>
+          <w:sz w:val="22"/>
+          <w:lang w:eastAsia="de-DE"/>
+          <w14:ligatures w14:val="none"/>
+        </w:rPr>
+      </w:pPr>
+    </w:p>
+    <w:p>
+      <w:pPr>
+        <w:autoSpaceDE w:val="0"/>
+        <w:autoSpaceDN w:val="0"/>
+        <w:adjustRightInd w:val="0"/>
+        <w:spacing w:after="0" w:line="240" w:lineRule="auto"/>
+        <w:ind w:left="708" w:right="-574" w:firstLine="708"/>
+        <w:rPr>
+          <w:rFonts w:ascii="Calibri" w:eastAsia="Times New Roman" w:hAnsi="Calibri" w:cs="Calibri"/>
+          <w:noProof/>
+          <w:kern w:val="0"/>
+          <w:sz w:val="22"/>
+          <w:lang w:eastAsia="de-DE"/>
+          <w14:ligatures w14:val="none"/>
+        </w:rPr>
+      </w:pPr>
+    </w:p>
+    <w:p>
+      <w:pPr>
+        <w:autoSpaceDE w:val="0"/>
+        <w:autoSpaceDN w:val="0"/>
+        <w:adjustRightInd w:val="0"/>
+        <w:spacing w:after="0" w:line="240" w:lineRule="auto"/>
+        <w:ind w:left="708" w:right="-574" w:firstLine="708"/>
+        <w:rPr>
+          <w:rFonts w:ascii="Calibri" w:eastAsia="Times New Roman" w:hAnsi="Calibri" w:cs="Calibri"/>
+          <w:noProof/>
+          <w:kern w:val="0"/>
+          <w:sz w:val="22"/>
+          <w:lang w:eastAsia="de-DE"/>
+          <w14:ligatures w14:val="none"/>
+        </w:rPr>
+      </w:pPr>
+    </w:p>
+    <w:p>
+      <w:pPr>
+        <w:autoSpaceDE w:val="0"/>
+        <w:autoSpaceDN w:val="0"/>
+        <w:adjustRightInd w:val="0"/>
+        <w:spacing w:after="0" w:line="240" w:lineRule="auto"/>
+        <w:ind w:left="708" w:right="-574" w:firstLine="708"/>
+        <w:rPr>
+          <w:rFonts w:ascii="Calibri" w:eastAsia="Times New Roman" w:hAnsi="Calibri" w:cs="Calibri"/>
+          <w:noProof/>
+          <w:kern w:val="0"/>
+          <w:sz w:val="22"/>
+          <w:lang w:eastAsia="de-DE"/>
+          <w14:ligatures w14:val="none"/>
+        </w:rPr>
+      </w:pPr>
+    </w:p>
+    <w:p>
+      <w:pPr>
+        <w:autoSpaceDE w:val="0"/>
+        <w:autoSpaceDN w:val="0"/>
+        <w:adjustRightInd w:val="0"/>
+        <w:spacing w:after="0" w:line="240" w:lineRule="auto"/>
+        <w:ind w:left="708" w:right="-574" w:firstLine="708"/>
+        <w:rPr>
+          <w:rFonts w:ascii="Calibri" w:eastAsia="Times New Roman" w:hAnsi="Calibri" w:cs="Calibri"/>
+          <w:noProof/>
+          <w:kern w:val="0"/>
+          <w:sz w:val="22"/>
+          <w:lang w:eastAsia="de-DE"/>
+          <w14:ligatures w14:val="none"/>
+        </w:rPr>
+      </w:pPr>
+    </w:p>
+    <w:p>
+      <w:pPr>
+        <w:autoSpaceDE w:val="0"/>
+        <w:autoSpaceDN w:val="0"/>
+        <w:adjustRightInd w:val="0"/>
+        <w:spacing w:after="0" w:line="240" w:lineRule="auto"/>
+        <w:ind w:left="708" w:right="-574" w:firstLine="708"/>
+        <w:rPr>
+          <w:rFonts w:ascii="Calibri" w:eastAsia="Times New Roman" w:hAnsi="Calibri" w:cs="Calibri"/>
+          <w:noProof/>
+          <w:kern w:val="0"/>
+          <w:sz w:val="22"/>
+          <w:lang w:eastAsia="de-DE"/>
+          <w14:ligatures w14:val="none"/>
+        </w:rPr>
+      </w:pPr>
+    </w:p>
+    <w:p>
+      <w:pPr>
+        <w:autoSpaceDE w:val="0"/>
+        <w:autoSpaceDN w:val="0"/>
+        <w:adjustRightInd w:val="0"/>
+        <w:spacing w:after="0" w:line="240" w:lineRule="auto"/>
+        <w:ind w:left="708" w:right="-574" w:firstLine="708"/>
+        <w:rPr>
+          <w:rFonts w:ascii="Calibri" w:eastAsia="Times New Roman" w:hAnsi="Calibri" w:cs="Calibri"/>
+          <w:noProof/>
+          <w:kern w:val="0"/>
+          <w:sz w:val="22"/>
+          <w:lang w:eastAsia="de-DE"/>
+          <w14:ligatures w14:val="none"/>
+        </w:rPr>
+      </w:pPr>
+    </w:p>
+    <w:p>
+      <w:pPr>
+        <w:autoSpaceDE w:val="0"/>
+        <w:autoSpaceDN w:val="0"/>
+        <w:adjustRightInd w:val="0"/>
+        <w:spacing w:after="0" w:line="240" w:lineRule="auto"/>
+        <w:ind w:left="708" w:right="-574" w:firstLine="708"/>
+        <w:rPr>
+          <w:rFonts w:ascii="Arial" w:eastAsia="Times New Roman" w:hAnsi="Arial" w:cs="Arial"/>
+          <w:noProof/>
+          <w:kern w:val="0"/>
+          <w:sz w:val="18"/>
+          <w:szCs w:val="18"/>
+          <w:lang w:eastAsia="de-DE"/>
+          <w14:ligatures w14:val="none"/>
+        </w:rPr>
+      </w:pPr>
+      <w:r>
+        <w:rPr>
+          <w:rFonts w:ascii="Arial" w:eastAsia="Times New Roman" w:hAnsi="Arial" w:cs="Arial"/>
+          <w:noProof/>
+          <w:kern w:val="0"/>
+          <w:sz w:val="18"/>
+          <w:szCs w:val="18"/>
+          <w:lang w:eastAsia="de-DE"/>
+          <w14:ligatures w14:val="none"/>
+        </w:rPr>
+        <w:t xml:space="preserve">Dieses Dokument wurde automatisiert durch die VFA-Akademie erstellt. </w:t>
+      </w:r>
+    </w:p>
+    <w:p>
+      <w:pPr>
+        <w:autoSpaceDE w:val="0"/>
+        <w:autoSpaceDN w:val="0"/>
+        <w:adjustRightInd w:val="0"/>
+        <w:spacing w:after="0" w:line="240" w:lineRule="auto"/>
+        <w:ind w:left="708" w:right="-574" w:firstLine="708"/>
         <w:rPr>
           <w:rFonts w:ascii="Arial" w:eastAsia="Times New Roman" w:hAnsi="Arial" w:cs="Calibri"/>
           <w:noProof/>
@@ -954,171 +930,36 @@
           <w14:ligatures w14:val="none"/>
         </w:rPr>
       </w:pPr>
-    </w:p>
-    <w:p>
-      <w:pPr>
-        <w:autoSpaceDE w:val="0"/>
-        <w:autoSpaceDN w:val="0"/>
-        <w:adjustRightInd w:val="0"/>
-        <w:spacing w:after="0" w:line="360" w:lineRule="auto"/>
-        <w:ind w:right="-574"/>
-        <w:jc w:val="center"/>
+      <w:r>
         <w:rPr>
           <w:rFonts w:ascii="Arial" w:eastAsia="Times New Roman" w:hAnsi="Arial" w:cs="Arial"/>
           <w:noProof/>
           <w:kern w:val="0"/>
-          <w:lang w:eastAsia="de-DE"/>
-          <w14:ligatures w14:val="none"/>
-        </w:rPr>
-      </w:pPr>
-    </w:p>
-    <w:p>
-      <w:pPr>
-        <w:tabs>
-          <w:tab w:val="left" w:pos="1418"/>
-          <w:tab w:val="left" w:pos="1843"/>
-        </w:tabs>
-        <w:autoSpaceDE w:val="0"/>
-        <w:autoSpaceDN w:val="0"/>
-        <w:adjustRightInd w:val="0"/>
-        <w:spacing w:after="0" w:line="360" w:lineRule="auto"/>
-        <w:ind w:right="-574"/>
+          <w:sz w:val="18"/>
+          <w:szCs w:val="18"/>
+          <w:lang w:eastAsia="de-DE"/>
+          <w14:ligatures w14:val="none"/>
+        </w:rPr>
+        <w:t>Die Echtheit kann über die VFA-Akademie-App geprüft werden.</w:t>
+      </w:r>
+      <w:r>
         <w:rPr>
           <w:rFonts w:ascii="Arial" w:eastAsia="Times New Roman" w:hAnsi="Arial" w:cs="Arial"/>
           <w:noProof/>
-          <w:color w:val="EE0000"/>
-          <w:kern w:val="0"/>
-          <w:lang w:eastAsia="de-DE"/>
-          <w14:ligatures w14:val="none"/>
-        </w:rPr>
-      </w:pPr>
-      <w:r>
-        <w:rPr>
-          <w:rFonts w:ascii="Calibri" w:eastAsia="Times New Roman" w:hAnsi="Calibri" w:cs="Times New Roman"/>
-          <w:noProof/>
-          <w:kern w:val="0"/>
-          <w:szCs w:val="22"/>
-          <w:lang w:eastAsia="de-DE"/>
-          <w14:ligatures w14:val="none"/>
-        </w:rPr>
-        <w:drawing>
-          <wp:anchor distT="0" distB="0" distL="114300" distR="114300" simplePos="0" relativeHeight="251659264" behindDoc="0" locked="0" layoutInCell="0" allowOverlap="0" wp14:anchorId="43782E87" wp14:editId="7A3ECD2D">
-            <wp:simplePos x="0" y="0"/>
-            <wp:positionH relativeFrom="page">
-              <wp:posOffset>1638300</wp:posOffset>
-            </wp:positionH>
-            <wp:positionV relativeFrom="page">
-              <wp:posOffset>7934325</wp:posOffset>
-            </wp:positionV>
-            <wp:extent cx="1563370" cy="635000"/>
-            <wp:effectExtent l="0" t="0" r="0" b="0"/>
-            <wp:wrapNone/>
-            <wp:docPr id="1951507415" name="Grafik 9" descr="Ein Bild, das Entwurf, Handschrift, Kalligrafie, Schrift enthält.&#10;&#10;KI-generierte Inhalte können fehlerhaft sein."/>
-            <wp:cNvGraphicFramePr>
-              <a:graphicFrameLocks xmlns:a="http://schemas.openxmlformats.org/drawingml/2006/main" noChangeAspect="1"/>
-            </wp:cNvGraphicFramePr>
-            <a:graphic xmlns:a="http://schemas.openxmlformats.org/drawingml/2006/main">
-              <a:graphicData uri="http://schemas.openxmlformats.org/drawingml/2006/picture">
-                <pic:pic xmlns:pic="http://schemas.openxmlformats.org/drawingml/2006/picture">
-                  <pic:nvPicPr>
-                    <pic:cNvPr id="1951507415" name="Grafik 9" descr="Ein Bild, das Entwurf, Handschrift, Kalligrafie, Schrift enthält.&#10;&#10;KI-generierte Inhalte können fehlerhaft sein."/>
-                    <pic:cNvPicPr>
-                      <a:picLocks noChangeAspect="1" noChangeArrowheads="1"/>
-                    </pic:cNvPicPr>
-                  </pic:nvPicPr>
-                  <pic:blipFill>
-                    <a:blip r:embed="rId6">
-                      <a:extLst>
-                        <a:ext uri="{28A0092B-C50C-407E-A947-70E740481C1C}">
-                          <a14:useLocalDpi xmlns:a14="http://schemas.microsoft.com/office/drawing/2010/main" val="0"/>
-                        </a:ext>
-                      </a:extLst>
-                    </a:blip>
-                    <a:srcRect/>
-                    <a:stretch>
-                      <a:fillRect/>
-                    </a:stretch>
-                  </pic:blipFill>
-                  <pic:spPr bwMode="auto">
-                    <a:xfrm>
-                      <a:off x="0" y="0"/>
-                      <a:ext cx="1563370" cy="635000"/>
-                    </a:xfrm>
-                    <a:prstGeom prst="rect">
-                      <a:avLst/>
-                    </a:prstGeom>
-                    <a:noFill/>
-                    <a:ln>
-                      <a:noFill/>
-                    </a:ln>
-                  </pic:spPr>
-                </pic:pic>
-              </a:graphicData>
-            </a:graphic>
-            <wp14:sizeRelH relativeFrom="page">
-              <wp14:pctWidth>0</wp14:pctWidth>
-            </wp14:sizeRelH>
-            <wp14:sizeRelV relativeFrom="page">
-              <wp14:pctHeight>0</wp14:pctHeight>
-            </wp14:sizeRelV>
-          </wp:anchor>
-        </w:drawing>
+          <w:kern w:val="0"/>
+          <w:sz w:val="20"/>
+          <w:szCs w:val="18"/>
+          <w:lang w:eastAsia="de-DE"/>
+          <w14:ligatures w14:val="none"/>
+        </w:rPr>
+        <w:t xml:space="preserve">   </w:t>
       </w:r>
       <w:r>
         <w:rPr>
           <w:rFonts w:ascii="Arial" w:eastAsia="Times New Roman" w:hAnsi="Arial" w:cs="Calibri"/>
-          <w:noProof/>
-          <w:kern w:val="0"/>
-          <w:lang w:eastAsia="de-DE"/>
-          <w14:ligatures w14:val="none"/>
-        </w:rPr>
-        <w:t xml:space="preserve">                               Hamburg, </w:t>
-      </w:r>
-      <w:r>
-        <w:rPr>
-          <w:rFonts w:ascii="Arial" w:eastAsia="Times New Roman" w:hAnsi="Arial" w:cs="Calibri"/>
-          <w:noProof/>
-          <w:kern w:val="0"/>
-          <w:lang w:eastAsia="de-DE"/>
-          <w14:ligatures w14:val="none"/>
-        </w:rPr>
-        <w:t>07.05</w:t>
-      </w:r>
-      <w:r>
-        <w:rPr>
-          <w:rFonts w:ascii="Arial" w:eastAsia="Times New Roman" w:hAnsi="Arial" w:cs="Calibri"/>
-          <w:noProof/>
-          <w:kern w:val="0"/>
-          <w:lang w:eastAsia="de-DE"/>
-          <w14:ligatures w14:val="none"/>
-        </w:rPr>
-        <w:t>.202</w:t>
-      </w:r>
-      <w:r>
-        <w:rPr>
-          <w:rFonts w:ascii="Arial" w:eastAsia="Times New Roman" w:hAnsi="Arial" w:cs="Calibri"/>
-          <w:noProof/>
-          <w:kern w:val="0"/>
-          <w:lang w:eastAsia="de-DE"/>
-          <w14:ligatures w14:val="none"/>
-        </w:rPr>
-        <w:t>6</w:t>
-      </w:r>
-      <w:r>
-        <w:rPr>
-          <w:rFonts w:ascii="Arial" w:eastAsia="Times New Roman" w:hAnsi="Arial" w:cs="Calibri"/>
-          <w:noProof/>
-          <w:kern w:val="0"/>
-          <w:lang w:eastAsia="de-DE"/>
-          <w14:ligatures w14:val="none"/>
-        </w:rPr>
-        <w:t xml:space="preserve"> </w:t>
-      </w:r>
-      <w:r>
-        <w:rPr>
-          <w:rFonts w:ascii="Arial" w:eastAsia="Times New Roman" w:hAnsi="Arial" w:cs="Calibri"/>
-          <w:noProof/>
-          <w:kern w:val="0"/>
+          <w:kern w:val="0"/>
+          <w:sz w:val="20"/>
+          <w:szCs w:val="18"/>
           <w:lang w:eastAsia="de-DE"/>
           <w14:ligatures w14:val="none"/>
         </w:rPr>
@@ -1126,275 +967,19 @@
       </w:r>
       <w:r>
         <w:rPr>
-          <w:rFonts w:ascii="Arial" w:eastAsia="Times New Roman" w:hAnsi="Arial" w:cs="Calibri"/>
-          <w:noProof/>
-          <w:kern w:val="0"/>
-          <w:lang w:eastAsia="de-DE"/>
-          <w14:ligatures w14:val="none"/>
-        </w:rPr>
-        <w:tab/>
-      </w:r>
-      <w:r>
-        <w:rPr>
-          <w:rFonts w:ascii="Arial" w:eastAsia="Times New Roman" w:hAnsi="Arial" w:cs="Calibri"/>
-          <w:noProof/>
-          <w:kern w:val="0"/>
-          <w:lang w:eastAsia="de-DE"/>
-          <w14:ligatures w14:val="none"/>
-        </w:rPr>
-        <w:tab/>
-        <w:t xml:space="preserve"> </w:t>
-      </w:r>
-      <w:r>
-        <w:rPr>
-          <w:rFonts w:ascii="Arial" w:eastAsia="Times New Roman" w:hAnsi="Arial" w:cs="Calibri"/>
-          <w:noProof/>
-          <w:kern w:val="0"/>
-          <w:lang w:eastAsia="de-DE"/>
-          <w14:ligatures w14:val="none"/>
-        </w:rPr>
-        <w:t xml:space="preserve">  </w:t>
-      </w:r>
-      <w:r>
-        <w:rPr>
-          <w:rFonts w:ascii="Arial" w:eastAsia="Times New Roman" w:hAnsi="Arial" w:cs="Calibri"/>
-          <w:noProof/>
-          <w:kern w:val="0"/>
-          <w:lang w:eastAsia="de-DE"/>
-          <w14:ligatures w14:val="none"/>
-        </w:rPr>
-        <w:t>Kiedrich</w:t>
-      </w:r>
-      <w:r>
-        <w:rPr>
-          <w:rFonts w:ascii="Arial" w:eastAsia="Times New Roman" w:hAnsi="Arial" w:cs="Calibri"/>
-          <w:noProof/>
-          <w:kern w:val="0"/>
-          <w:lang w:eastAsia="de-DE"/>
-          <w14:ligatures w14:val="none"/>
-        </w:rPr>
-        <w:t>,</w:t>
-      </w:r>
-      <w:r>
-        <w:rPr>
-          <w:rFonts w:ascii="Arial" w:eastAsia="Times New Roman" w:hAnsi="Arial" w:cs="Calibri"/>
-          <w:noProof/>
-          <w:kern w:val="0"/>
-          <w:lang w:eastAsia="de-DE"/>
-          <w14:ligatures w14:val="none"/>
-        </w:rPr>
-        <w:t xml:space="preserve"> </w:t>
-      </w:r>
-      <w:r>
-        <w:rPr>
-          <w:rFonts w:ascii="Arial" w:eastAsia="Times New Roman" w:hAnsi="Arial" w:cs="Calibri"/>
-          <w:noProof/>
-          <w:kern w:val="0"/>
-          <w:lang w:eastAsia="de-DE"/>
-          <w14:ligatures w14:val="none"/>
-        </w:rPr>
-        <w:t>07.05.</w:t>
-      </w:r>
-      <w:r>
-        <w:rPr>
-          <w:rFonts w:ascii="Arial" w:eastAsia="Times New Roman" w:hAnsi="Arial" w:cs="Calibri"/>
-          <w:noProof/>
-          <w:kern w:val="0"/>
-          <w:lang w:eastAsia="de-DE"/>
-          <w14:ligatures w14:val="none"/>
-        </w:rPr>
-        <w:t>202</w:t>
-      </w:r>
-      <w:r>
-        <w:rPr>
-          <w:rFonts w:ascii="Arial" w:eastAsia="Times New Roman" w:hAnsi="Arial" w:cs="Calibri"/>
-          <w:noProof/>
-          <w:kern w:val="0"/>
-          <w:lang w:eastAsia="de-DE"/>
-          <w14:ligatures w14:val="none"/>
-        </w:rPr>
-        <w:t>6</w:t>
-      </w:r>
-    </w:p>
-    <w:p>
-      <w:pPr>
-        <w:autoSpaceDE w:val="0"/>
-        <w:autoSpaceDN w:val="0"/>
-        <w:adjustRightInd w:val="0"/>
-        <w:spacing w:after="0" w:line="360" w:lineRule="auto"/>
-        <w:ind w:left="-567" w:right="-574"/>
-        <w:jc w:val="center"/>
-        <w:rPr>
-          <w:rFonts w:ascii="Arial" w:eastAsia="Times New Roman" w:hAnsi="Arial" w:cs="Calibri"/>
-          <w:noProof/>
-          <w:kern w:val="0"/>
-          <w:sz w:val="22"/>
-          <w:lang w:eastAsia="de-DE"/>
-          <w14:ligatures w14:val="none"/>
-        </w:rPr>
-      </w:pPr>
-    </w:p>
-    <w:p>
-      <w:pPr>
-        <w:autoSpaceDE w:val="0"/>
-        <w:autoSpaceDN w:val="0"/>
-        <w:adjustRightInd w:val="0"/>
-        <w:spacing w:after="0" w:line="240" w:lineRule="auto"/>
-        <w:ind w:left="-567" w:right="-574"/>
-        <w:jc w:val="center"/>
-        <w:rPr>
           <w:rFonts w:ascii="Arial" w:eastAsia="Times New Roman" w:hAnsi="Arial" w:cs="Arial"/>
           <w:noProof/>
           <w:kern w:val="0"/>
           <w:sz w:val="20"/>
-          <w:lang w:eastAsia="de-DE"/>
-          <w14:ligatures w14:val="none"/>
-        </w:rPr>
-      </w:pPr>
+          <w:szCs w:val="18"/>
+          <w:lang w:eastAsia="de-DE"/>
+          <w14:ligatures w14:val="none"/>
+        </w:rPr>
+        <w:t xml:space="preserve">                                    </w:t>
+      </w:r>
       <w:r>
         <w:rPr>
           <w:rFonts w:ascii="Arial" w:eastAsia="Times New Roman" w:hAnsi="Arial" w:cs="Arial"/>
-          <w:noProof/>
-          <w:kern w:val="0"/>
-          <w:sz w:val="22"/>
-          <w:lang w:eastAsia="de-DE"/>
-          <w14:ligatures w14:val="none"/>
-        </w:rPr>
-        <w:t xml:space="preserve">                                  </w:t>
-      </w:r>
-      <w:r>
-        <w:rPr>
-          <w:rFonts w:ascii="Arial" w:eastAsia="Times New Roman" w:hAnsi="Arial" w:cs="Calibri"/>
-          <w:noProof/>
-          <w:kern w:val="0"/>
-          <w:lang w:eastAsia="de-DE"/>
-          <w14:ligatures w14:val="none"/>
-        </w:rPr>
-        <w:t xml:space="preserve">         </w:t>
-      </w:r>
-    </w:p>
-    <w:p>
-      <w:pPr>
-        <w:autoSpaceDE w:val="0"/>
-        <w:autoSpaceDN w:val="0"/>
-        <w:adjustRightInd w:val="0"/>
-        <w:spacing w:after="0" w:line="240" w:lineRule="auto"/>
-        <w:ind w:left="849" w:right="-574" w:firstLine="567"/>
-        <w:rPr>
-          <w:rFonts w:ascii="Arial" w:eastAsia="Times New Roman" w:hAnsi="Arial" w:cs="Calibri"/>
-          <w:kern w:val="0"/>
-          <w:sz w:val="26"/>
-          <w:lang w:eastAsia="de-DE"/>
-          <w14:ligatures w14:val="none"/>
-        </w:rPr>
-      </w:pPr>
-      <w:r>
-        <w:rPr>
-          <w:rFonts w:ascii="Arial" w:eastAsia="Times New Roman" w:hAnsi="Arial" w:cs="Calibri"/>
-          <w:noProof/>
-          <w:kern w:val="0"/>
-          <w:sz w:val="26"/>
-          <w:lang w:eastAsia="de-DE"/>
-          <w14:ligatures w14:val="none"/>
-        </w:rPr>
-        <w:t xml:space="preserve">  </w:t>
-      </w:r>
-      <w:r>
-        <w:rPr>
-          <w:rFonts w:ascii="Arial" w:eastAsia="Times New Roman" w:hAnsi="Arial" w:cs="Arial"/>
-          <w:kern w:val="0"/>
-          <w:sz w:val="26"/>
-          <w:lang w:eastAsia="de-DE"/>
-          <w14:ligatures w14:val="none"/>
-        </w:rPr>
-        <w:tab/>
-        <w:t xml:space="preserve">        </w:t>
-      </w:r>
-    </w:p>
-    <w:p>
-      <w:pPr>
-        <w:autoSpaceDE w:val="0"/>
-        <w:autoSpaceDN w:val="0"/>
-        <w:adjustRightInd w:val="0"/>
-        <w:spacing w:after="0" w:line="240" w:lineRule="auto"/>
-        <w:ind w:left="849" w:right="-574" w:firstLine="567"/>
-        <w:rPr>
-          <w:rFonts w:ascii="Arial" w:eastAsia="Times New Roman" w:hAnsi="Arial" w:cs="Arial"/>
-          <w:noProof/>
-          <w:kern w:val="0"/>
-          <w:sz w:val="26"/>
-          <w:lang w:eastAsia="de-DE"/>
-          <w14:ligatures w14:val="none"/>
-        </w:rPr>
-      </w:pPr>
-      <w:r>
-        <w:rPr>
-          <w:rFonts w:ascii="Arial" w:eastAsia="Times New Roman" w:hAnsi="Arial" w:cs="Arial"/>
-          <w:kern w:val="0"/>
-          <w:sz w:val="26"/>
-          <w:lang w:eastAsia="de-DE"/>
-          <w14:ligatures w14:val="none"/>
-        </w:rPr>
-        <w:t xml:space="preserve">          </w:t>
-      </w:r>
-      <w:r>
-        <w:rPr>
-          <w:rFonts w:ascii="Arial" w:eastAsia="Times New Roman" w:hAnsi="Arial" w:cs="Arial"/>
-          <w:kern w:val="0"/>
-          <w:sz w:val="26"/>
-          <w:lang w:eastAsia="de-DE"/>
-          <w14:ligatures w14:val="none"/>
-        </w:rPr>
-        <w:t xml:space="preserve"> </w:t>
-      </w:r>
-      <w:r>
-        <w:rPr>
-          <w:rFonts w:ascii="Arial" w:eastAsia="Times New Roman" w:hAnsi="Arial" w:cs="Calibri"/>
-          <w:noProof/>
-          <w:kern w:val="0"/>
-          <w:sz w:val="26"/>
-          <w:lang w:eastAsia="de-DE"/>
-          <w14:ligatures w14:val="none"/>
-        </w:rPr>
-        <w:t>Andreas Hönnige</w:t>
-      </w:r>
-      <w:r>
-        <w:rPr>
-          <w:rFonts w:ascii="Arial" w:eastAsia="Times New Roman" w:hAnsi="Arial" w:cs="Calibri"/>
-          <w:noProof/>
-          <w:kern w:val="0"/>
-          <w:sz w:val="26"/>
-          <w:lang w:eastAsia="de-DE"/>
-          <w14:ligatures w14:val="none"/>
-        </w:rPr>
-        <w:tab/>
-      </w:r>
-      <w:r>
-        <w:rPr>
-          <w:rFonts w:ascii="Arial" w:eastAsia="Times New Roman" w:hAnsi="Arial" w:cs="Calibri"/>
-          <w:noProof/>
-          <w:kern w:val="0"/>
-          <w:sz w:val="26"/>
-          <w:lang w:eastAsia="de-DE"/>
-          <w14:ligatures w14:val="none"/>
-        </w:rPr>
-        <w:tab/>
-      </w:r>
-      <w:r>
-        <w:rPr>
-          <w:rFonts w:ascii="Arial" w:eastAsia="Times New Roman" w:hAnsi="Arial" w:cs="Calibri"/>
-          <w:noProof/>
-          <w:kern w:val="0"/>
-          <w:sz w:val="26"/>
-          <w:lang w:eastAsia="de-DE"/>
-          <w14:ligatures w14:val="none"/>
-        </w:rPr>
-        <w:tab/>
-        <w:t xml:space="preserve">         </w:t>
-      </w:r>
-      <w:r>
-        <w:rPr>
-          <w:rFonts w:ascii="Arial" w:eastAsia="Times New Roman" w:hAnsi="Arial" w:cs="Calibri"/>
           <w:noProof/>
           <w:kern w:val="0"/>
           <w:sz w:val="26"/>
@@ -1404,170 +989,6 @@
         <w:tab/>
         <w:t xml:space="preserve">   </w:t>
       </w:r>
-      <w:r>
-        <w:rPr>
-          <w:rFonts w:ascii="Arial" w:eastAsia="Times New Roman" w:hAnsi="Arial" w:cs="Calibri"/>
-          <w:noProof/>
-          <w:kern w:val="0"/>
-          <w:sz w:val="26"/>
-          <w:lang w:eastAsia="de-DE"/>
-          <w14:ligatures w14:val="none"/>
-        </w:rPr>
-        <w:t xml:space="preserve"> </w:t>
-      </w:r>
-      <w:r>
-        <w:rPr>
-          <w:rFonts w:ascii="Arial" w:eastAsia="Times New Roman" w:hAnsi="Arial" w:cs="Calibri"/>
-          <w:noProof/>
-          <w:kern w:val="0"/>
-          <w:sz w:val="26"/>
-          <w:lang w:eastAsia="de-DE"/>
-          <w14:ligatures w14:val="none"/>
-        </w:rPr>
-        <w:t xml:space="preserve">  </w:t>
-      </w:r>
-      <w:r>
-        <w:rPr>
-          <w:rFonts w:ascii="Arial" w:eastAsia="Times New Roman" w:hAnsi="Arial" w:cs="Calibri"/>
-          <w:noProof/>
-          <w:kern w:val="0"/>
-          <w:sz w:val="26"/>
-          <w:lang w:eastAsia="de-DE"/>
-          <w14:ligatures w14:val="none"/>
-        </w:rPr>
-        <w:t>Nikolai Thoma</w:t>
-      </w:r>
-    </w:p>
-    <w:p>
-      <w:pPr>
-        <w:autoSpaceDE w:val="0"/>
-        <w:autoSpaceDN w:val="0"/>
-        <w:adjustRightInd w:val="0"/>
-        <w:spacing w:after="0" w:line="240" w:lineRule="auto"/>
-        <w:ind w:left="708" w:right="-574" w:firstLine="849"/>
-        <w:rPr>
-          <w:rFonts w:ascii="Arial" w:eastAsia="Times New Roman" w:hAnsi="Arial" w:cs="Calibri"/>
-          <w:noProof/>
-          <w:kern w:val="0"/>
-          <w:sz w:val="26"/>
-          <w:lang w:eastAsia="de-DE"/>
-          <w14:ligatures w14:val="none"/>
-        </w:rPr>
-      </w:pPr>
-      <w:r>
-        <w:rPr>
-          <w:rFonts w:ascii="Arial" w:eastAsia="Times New Roman" w:hAnsi="Arial" w:cs="Calibri"/>
-          <w:kern w:val="0"/>
-          <w:sz w:val="26"/>
-          <w:lang w:eastAsia="de-DE"/>
-          <w14:ligatures w14:val="none"/>
-        </w:rPr>
-        <w:t xml:space="preserve">    VFA-</w:t>
-      </w:r>
-      <w:r>
-        <w:rPr>
-          <w:rFonts w:ascii="Arial" w:eastAsia="Times New Roman" w:hAnsi="Arial" w:cs="Arial"/>
-          <w:noProof/>
-          <w:kern w:val="0"/>
-          <w:sz w:val="26"/>
-          <w:lang w:eastAsia="de-DE"/>
-          <w14:ligatures w14:val="none"/>
-        </w:rPr>
-        <w:t>Akademie gGmbH</w:t>
-      </w:r>
-      <w:r>
-        <w:rPr>
-          <w:rFonts w:ascii="Arial" w:eastAsia="Times New Roman" w:hAnsi="Arial" w:cs="Arial"/>
-          <w:noProof/>
-          <w:kern w:val="0"/>
-          <w:sz w:val="26"/>
-          <w:lang w:eastAsia="de-DE"/>
-          <w14:ligatures w14:val="none"/>
-        </w:rPr>
-        <w:tab/>
-      </w:r>
-      <w:r>
-        <w:rPr>
-          <w:rFonts w:ascii="Arial" w:eastAsia="Times New Roman" w:hAnsi="Arial" w:cs="Arial"/>
-          <w:noProof/>
-          <w:kern w:val="0"/>
-          <w:sz w:val="26"/>
-          <w:lang w:eastAsia="de-DE"/>
-          <w14:ligatures w14:val="none"/>
-        </w:rPr>
-        <w:tab/>
-        <w:t xml:space="preserve">         VFA-Akademie gGmbH</w:t>
-      </w:r>
-    </w:p>
-    <w:p>
-      <w:pPr>
-        <w:autoSpaceDE w:val="0"/>
-        <w:autoSpaceDN w:val="0"/>
-        <w:adjustRightInd w:val="0"/>
-        <w:spacing w:after="0" w:line="240" w:lineRule="auto"/>
-        <w:ind w:left="708" w:right="-574" w:firstLine="708"/>
-        <w:rPr>
-          <w:rFonts w:ascii="Arial" w:eastAsia="Times New Roman" w:hAnsi="Arial" w:cs="Calibri"/>
-          <w:noProof/>
-          <w:kern w:val="0"/>
-          <w:lang w:eastAsia="de-DE"/>
-          <w14:ligatures w14:val="none"/>
-        </w:rPr>
-      </w:pPr>
-      <w:r>
-        <w:rPr>
-          <w:rFonts w:ascii="Arial" w:eastAsia="Times New Roman" w:hAnsi="Arial" w:cs="Arial"/>
-          <w:noProof/>
-          <w:kern w:val="0"/>
-          <w:sz w:val="26"/>
-          <w:lang w:eastAsia="de-DE"/>
-          <w14:ligatures w14:val="none"/>
-        </w:rPr>
-        <w:t xml:space="preserve">   </w:t>
-      </w:r>
-      <w:r>
-        <w:rPr>
-          <w:rFonts w:ascii="Arial" w:eastAsia="Times New Roman" w:hAnsi="Arial" w:cs="Calibri"/>
-          <w:kern w:val="0"/>
-          <w:sz w:val="26"/>
-          <w:lang w:eastAsia="de-DE"/>
-          <w14:ligatures w14:val="none"/>
-        </w:rPr>
-        <w:tab/>
-      </w:r>
-      <w:r>
-        <w:rPr>
-          <w:rFonts w:ascii="Arial" w:eastAsia="Times New Roman" w:hAnsi="Arial" w:cs="Calibri"/>
-          <w:kern w:val="0"/>
-          <w:sz w:val="26"/>
-          <w:lang w:eastAsia="de-DE"/>
-          <w14:ligatures w14:val="none"/>
-        </w:rPr>
-        <w:t xml:space="preserve">  </w:t>
-      </w:r>
-      <w:r>
-        <w:rPr>
-          <w:rFonts w:ascii="Arial" w:eastAsia="Times New Roman" w:hAnsi="Arial" w:cs="Arial"/>
-          <w:noProof/>
-          <w:kern w:val="0"/>
-          <w:sz w:val="26"/>
-          <w:lang w:eastAsia="de-DE"/>
-          <w14:ligatures w14:val="none"/>
-        </w:rPr>
-        <w:t xml:space="preserve">Geschäftsführer                                       </w:t>
-      </w:r>
-      <w:r>
-        <w:rPr>
-          <w:rFonts w:ascii="Arial" w:eastAsia="Times New Roman" w:hAnsi="Arial" w:cs="Arial"/>
-          <w:noProof/>
-          <w:kern w:val="0"/>
-          <w:sz w:val="26"/>
-          <w:lang w:eastAsia="de-DE"/>
-          <w14:ligatures w14:val="none"/>
-        </w:rPr>
-        <w:tab/>
-        <w:t xml:space="preserve">   </w:t>
-      </w:r>
     </w:p>
     <w:p>
       <w:pPr>
@@ -1575,8 +996,8 @@
       </w:pPr>
     </w:p>
     <w:sectPr>
-      <w:headerReference w:type="default" r:id="rId7"/>
-      <w:footerReference w:type="default" r:id="rId8"/>
+      <w:headerReference w:type="default" r:id="rId6"/>
+      <w:footerReference w:type="default" r:id="rId7"/>
       <w:pgSz w:w="11907" w:h="16839" w:code="9"/>
       <w:pgMar w:top="1417" w:right="1417" w:bottom="1134" w:left="574" w:header="720" w:footer="720" w:gutter="0"/>
       <w:cols w:space="720"/>
@@ -2583,7 +2004,6 @@
   <w:style w:type="character" w:default="1" w:styleId="Absatz-Standardschriftart">
     <w:name w:val="Default Paragraph Font"/>
     <w:uiPriority w:val="1"/>
-    <w:semiHidden/>
     <w:unhideWhenUsed/>
   </w:style>
   <w:style w:type="table" w:default="1" w:styleId="NormaleTabelle">

</xml_diff>

<commit_message>
Serve certificate templates from public folder
</commit_message>
<xml_diff>
--- a/public/certificate-templates/VDI2168_A1_Teilnahmebestaetigung.docx
+++ b/public/certificate-templates/VDI2168_A1_Teilnahmebestaetigung.docx
@@ -61,18 +61,19 @@
         <w:jc w:val="center"/>
         <w:outlineLvl w:val="3"/>
         <w:rPr>
-          <w:rFonts w:ascii="Arial" w:eastAsia="Times New Roman" w:hAnsi="Arial" w:cs="Calibri"/>
+          <w:rFonts w:ascii="Arial" w:eastAsia="Times New Roman" w:hAnsi="Arial" w:cs="Arial"/>
           <w:b/>
           <w:noProof/>
           <w:color w:val="000000"/>
           <w:kern w:val="0"/>
+          <w:sz w:val="40"/>
           <w:lang w:eastAsia="de-DE"/>
           <w14:ligatures w14:val="none"/>
         </w:rPr>
       </w:pPr>
       <w:r>
         <w:rPr>
-          <w:rFonts w:ascii="Arial" w:eastAsia="Times New Roman" w:hAnsi="Arial" w:cs="Calibri"/>
+          <w:rFonts w:ascii="Arial" w:eastAsia="Times New Roman" w:hAnsi="Arial" w:cs="Arial"/>
           <w:b/>
           <w:noProof/>
           <w:color w:val="000000"/>
@@ -81,33 +82,7 @@
           <w:lang w:eastAsia="de-DE"/>
           <w14:ligatures w14:val="none"/>
         </w:rPr>
-        <w:t>{firstName}</w:t>
-      </w:r>
-      <w:r>
-        <w:rPr>
-          <w:rFonts w:ascii="Arial" w:eastAsia="Times New Roman" w:hAnsi="Arial" w:cs="Calibri"/>
-          <w:b/>
-          <w:noProof/>
-          <w:color w:val="000000"/>
-          <w:kern w:val="0"/>
-          <w:sz w:val="40"/>
-          <w:lang w:eastAsia="de-DE"/>
-          <w14:ligatures w14:val="none"/>
-        </w:rPr>
-        <w:t xml:space="preserve"> </w:t>
-      </w:r>
-      <w:r>
-        <w:rPr>
-          <w:rFonts w:ascii="Arial" w:eastAsia="Times New Roman" w:hAnsi="Arial" w:cs="Calibri"/>
-          <w:b/>
-          <w:noProof/>
-          <w:color w:val="000000"/>
-          <w:kern w:val="0"/>
-          <w:sz w:val="40"/>
-          <w:lang w:eastAsia="de-DE"/>
-          <w14:ligatures w14:val="none"/>
-        </w:rPr>
-        <w:t>{lastName}</w:t>
+        <w:t>{{participantName}}</w:t>
       </w:r>
     </w:p>
     <w:p>
@@ -147,23 +122,7 @@
           <w:b/>
           <w:bCs/>
         </w:rPr>
-        <w:t>{</w:t>
-      </w:r>
-      <w:proofErr w:type="spellStart"/>
-      <w:r>
-        <w:rPr>
-          <w:b/>
-          <w:bCs/>
-        </w:rPr>
-        <w:t>birthDate</w:t>
-      </w:r>
-      <w:proofErr w:type="spellEnd"/>
-      <w:r>
-        <w:rPr>
-          <w:b/>
-          <w:bCs/>
-        </w:rPr>
-        <w:t>}</w:t>
+        <w:t>{{participantBirthDate}}</w:t>
       </w:r>
     </w:p>
     <w:p>
@@ -219,37 +178,7 @@
           <w:lang w:eastAsia="de-DE"/>
           <w14:ligatures w14:val="none"/>
         </w:rPr>
-        <w:t>im Zeitraum</w:t>
-      </w:r>
-      <w:r>
-        <w:rPr>
-          <w:rFonts w:ascii="Arial" w:eastAsia="Times New Roman" w:hAnsi="Arial" w:cs="Calibri"/>
-          <w:noProof/>
-          <w:kern w:val="0"/>
-          <w:lang w:eastAsia="de-DE"/>
-          <w14:ligatures w14:val="none"/>
-        </w:rPr>
-        <w:t xml:space="preserve"> </w:t>
-      </w:r>
-      <w:r>
-        <w:rPr>
-          <w:rFonts w:ascii="Arial" w:eastAsia="Times New Roman" w:hAnsi="Arial" w:cs="Arial"/>
-          <w:noProof/>
-          <w:kern w:val="0"/>
-          <w:lang w:eastAsia="de-DE"/>
-          <w14:ligatures w14:val="none"/>
-        </w:rPr>
-        <w:t>{trainingPeriod}</w:t>
-      </w:r>
-      <w:r>
-        <w:rPr>
-          <w:rFonts w:ascii="Arial" w:eastAsia="Times New Roman" w:hAnsi="Arial" w:cs="Arial"/>
-          <w:noProof/>
-          <w:kern w:val="0"/>
-          <w:lang w:eastAsia="de-DE"/>
-          <w14:ligatures w14:val="none"/>
-        </w:rPr>
-        <w:t xml:space="preserve"> </w:t>
+        <w:t xml:space="preserve">{{trainingDateRange}} </w:t>
       </w:r>
       <w:r>
         <w:rPr>
@@ -269,7 +198,7 @@
           <w:lang w:eastAsia="de-DE"/>
           <w14:ligatures w14:val="none"/>
         </w:rPr>
-        <w:t>{location}</w:t>
+        <w:t>{{trainingLocation}}</w:t>
       </w:r>
     </w:p>
     <w:p>
@@ -375,6 +304,7 @@
         </w:rPr>
       </w:pPr>
     </w:p>
+    <w:bookmarkEnd w:id="0"/>
     <w:p>
       <w:pPr>
         <w:autoSpaceDE w:val="0"/>
@@ -383,17 +313,6 @@
         <w:spacing w:after="0" w:line="240" w:lineRule="auto"/>
         <w:ind w:right="-574"/>
         <w:jc w:val="center"/>
-        <w:rPr>
-          <w:rFonts w:ascii="Arial" w:eastAsia="Times New Roman" w:hAnsi="Arial" w:cs="Calibri"/>
-          <w:b/>
-          <w:noProof/>
-          <w:kern w:val="0"/>
-          <w:sz w:val="32"/>
-          <w:lang w:eastAsia="de-DE"/>
-          <w14:ligatures w14:val="none"/>
-        </w:rPr>
-      </w:pPr>
-      <w:r>
         <w:rPr>
           <w:rFonts w:ascii="Arial" w:eastAsia="Times New Roman" w:hAnsi="Arial" w:cs="Arial"/>
           <w:b/>
@@ -403,9 +322,19 @@
           <w:lang w:eastAsia="de-DE"/>
           <w14:ligatures w14:val="none"/>
         </w:rPr>
-        <w:t>Grundkurs A1</w:t>
+      </w:pPr>
+      <w:r>
+        <w:rPr>
+          <w:rFonts w:ascii="Arial" w:eastAsia="Times New Roman" w:hAnsi="Arial" w:cs="Arial"/>
+          <w:b/>
+          <w:noProof/>
+          <w:kern w:val="0"/>
+          <w:sz w:val="32"/>
+          <w:lang w:eastAsia="de-DE"/>
+          <w14:ligatures w14:val="none"/>
+        </w:rPr>
+        <w:t>{{trainingTitle}}</w:t>
       </w:r>
-      <w:bookmarkEnd w:id="0"/>
     </w:p>
     <w:p>
       <w:pPr>
@@ -686,8 +615,8 @@
         <w:autoSpaceDE w:val="0"/>
         <w:autoSpaceDN w:val="0"/>
         <w:adjustRightInd w:val="0"/>
-        <w:spacing w:after="0" w:line="240" w:lineRule="auto"/>
-        <w:ind w:left="708" w:right="-574" w:firstLine="708"/>
+        <w:spacing w:after="0" w:line="360" w:lineRule="auto"/>
+        <w:ind w:right="-574"/>
         <w:rPr>
           <w:rFonts w:ascii="Calibri" w:eastAsia="Times New Roman" w:hAnsi="Calibri" w:cs="Calibri"/>
           <w:noProof/>
@@ -703,225 +632,75 @@
         <w:autoSpaceDE w:val="0"/>
         <w:autoSpaceDN w:val="0"/>
         <w:adjustRightInd w:val="0"/>
-        <w:spacing w:after="0" w:line="240" w:lineRule="auto"/>
-        <w:ind w:left="708" w:right="-574" w:firstLine="708"/>
-        <w:rPr>
-          <w:rFonts w:ascii="Calibri" w:eastAsia="Times New Roman" w:hAnsi="Calibri" w:cs="Calibri"/>
-          <w:noProof/>
-          <w:kern w:val="0"/>
-          <w:sz w:val="22"/>
-          <w:lang w:eastAsia="de-DE"/>
-          <w14:ligatures w14:val="none"/>
-        </w:rPr>
-      </w:pPr>
-    </w:p>
-    <w:p>
-      <w:pPr>
-        <w:autoSpaceDE w:val="0"/>
-        <w:autoSpaceDN w:val="0"/>
-        <w:adjustRightInd w:val="0"/>
-        <w:spacing w:after="0" w:line="240" w:lineRule="auto"/>
-        <w:ind w:left="708" w:right="-574" w:firstLine="708"/>
-        <w:rPr>
-          <w:rFonts w:ascii="Calibri" w:eastAsia="Times New Roman" w:hAnsi="Calibri" w:cs="Calibri"/>
-          <w:noProof/>
-          <w:kern w:val="0"/>
-          <w:sz w:val="22"/>
-          <w:lang w:eastAsia="de-DE"/>
-          <w14:ligatures w14:val="none"/>
-        </w:rPr>
-      </w:pPr>
-    </w:p>
-    <w:p>
-      <w:pPr>
-        <w:autoSpaceDE w:val="0"/>
-        <w:autoSpaceDN w:val="0"/>
-        <w:adjustRightInd w:val="0"/>
-        <w:spacing w:after="0" w:line="240" w:lineRule="auto"/>
-        <w:ind w:left="708" w:right="-574" w:firstLine="708"/>
-        <w:rPr>
-          <w:rFonts w:ascii="Calibri" w:eastAsia="Times New Roman" w:hAnsi="Calibri" w:cs="Calibri"/>
-          <w:noProof/>
-          <w:kern w:val="0"/>
-          <w:sz w:val="22"/>
-          <w:lang w:eastAsia="de-DE"/>
-          <w14:ligatures w14:val="none"/>
-        </w:rPr>
-      </w:pPr>
-    </w:p>
-    <w:p>
-      <w:pPr>
-        <w:autoSpaceDE w:val="0"/>
-        <w:autoSpaceDN w:val="0"/>
-        <w:adjustRightInd w:val="0"/>
-        <w:spacing w:after="0" w:line="240" w:lineRule="auto"/>
-        <w:ind w:left="708" w:right="-574" w:firstLine="708"/>
-        <w:rPr>
-          <w:rFonts w:ascii="Calibri" w:eastAsia="Times New Roman" w:hAnsi="Calibri" w:cs="Calibri"/>
-          <w:noProof/>
-          <w:kern w:val="0"/>
-          <w:sz w:val="22"/>
-          <w:lang w:eastAsia="de-DE"/>
-          <w14:ligatures w14:val="none"/>
-        </w:rPr>
-      </w:pPr>
-    </w:p>
-    <w:p>
-      <w:pPr>
-        <w:autoSpaceDE w:val="0"/>
-        <w:autoSpaceDN w:val="0"/>
-        <w:adjustRightInd w:val="0"/>
-        <w:spacing w:after="0" w:line="240" w:lineRule="auto"/>
-        <w:ind w:left="708" w:right="-574" w:firstLine="708"/>
-        <w:rPr>
-          <w:rFonts w:ascii="Calibri" w:eastAsia="Times New Roman" w:hAnsi="Calibri" w:cs="Calibri"/>
-          <w:noProof/>
-          <w:kern w:val="0"/>
-          <w:sz w:val="22"/>
-          <w:lang w:eastAsia="de-DE"/>
-          <w14:ligatures w14:val="none"/>
-        </w:rPr>
-      </w:pPr>
-    </w:p>
-    <w:p>
-      <w:pPr>
-        <w:autoSpaceDE w:val="0"/>
-        <w:autoSpaceDN w:val="0"/>
-        <w:adjustRightInd w:val="0"/>
-        <w:spacing w:after="0" w:line="240" w:lineRule="auto"/>
-        <w:ind w:left="708" w:right="-574" w:firstLine="708"/>
-        <w:rPr>
-          <w:rFonts w:ascii="Calibri" w:eastAsia="Times New Roman" w:hAnsi="Calibri" w:cs="Calibri"/>
-          <w:noProof/>
-          <w:kern w:val="0"/>
-          <w:sz w:val="22"/>
-          <w:lang w:eastAsia="de-DE"/>
-          <w14:ligatures w14:val="none"/>
-        </w:rPr>
-      </w:pPr>
-    </w:p>
-    <w:p>
-      <w:pPr>
-        <w:autoSpaceDE w:val="0"/>
-        <w:autoSpaceDN w:val="0"/>
-        <w:adjustRightInd w:val="0"/>
-        <w:spacing w:after="0" w:line="240" w:lineRule="auto"/>
-        <w:ind w:left="708" w:right="-574" w:firstLine="708"/>
-        <w:rPr>
-          <w:rFonts w:ascii="Calibri" w:eastAsia="Times New Roman" w:hAnsi="Calibri" w:cs="Calibri"/>
-          <w:noProof/>
-          <w:kern w:val="0"/>
-          <w:sz w:val="22"/>
-          <w:lang w:eastAsia="de-DE"/>
-          <w14:ligatures w14:val="none"/>
-        </w:rPr>
-      </w:pPr>
-    </w:p>
-    <w:p>
-      <w:pPr>
-        <w:autoSpaceDE w:val="0"/>
-        <w:autoSpaceDN w:val="0"/>
-        <w:adjustRightInd w:val="0"/>
-        <w:spacing w:after="0" w:line="240" w:lineRule="auto"/>
-        <w:ind w:left="708" w:right="-574" w:firstLine="708"/>
-        <w:rPr>
-          <w:rFonts w:ascii="Calibri" w:eastAsia="Times New Roman" w:hAnsi="Calibri" w:cs="Calibri"/>
-          <w:noProof/>
-          <w:kern w:val="0"/>
-          <w:sz w:val="22"/>
-          <w:lang w:eastAsia="de-DE"/>
-          <w14:ligatures w14:val="none"/>
-        </w:rPr>
-      </w:pPr>
-    </w:p>
-    <w:p>
-      <w:pPr>
-        <w:autoSpaceDE w:val="0"/>
-        <w:autoSpaceDN w:val="0"/>
-        <w:adjustRightInd w:val="0"/>
-        <w:spacing w:after="0" w:line="240" w:lineRule="auto"/>
-        <w:ind w:left="708" w:right="-574" w:firstLine="708"/>
-        <w:rPr>
-          <w:rFonts w:ascii="Calibri" w:eastAsia="Times New Roman" w:hAnsi="Calibri" w:cs="Calibri"/>
-          <w:noProof/>
-          <w:kern w:val="0"/>
-          <w:sz w:val="22"/>
-          <w:lang w:eastAsia="de-DE"/>
-          <w14:ligatures w14:val="none"/>
-        </w:rPr>
-      </w:pPr>
-    </w:p>
-    <w:p>
-      <w:pPr>
-        <w:autoSpaceDE w:val="0"/>
-        <w:autoSpaceDN w:val="0"/>
-        <w:adjustRightInd w:val="0"/>
-        <w:spacing w:after="0" w:line="240" w:lineRule="auto"/>
-        <w:ind w:left="708" w:right="-574" w:firstLine="708"/>
-        <w:rPr>
-          <w:rFonts w:ascii="Calibri" w:eastAsia="Times New Roman" w:hAnsi="Calibri" w:cs="Calibri"/>
-          <w:noProof/>
-          <w:kern w:val="0"/>
-          <w:sz w:val="22"/>
-          <w:lang w:eastAsia="de-DE"/>
-          <w14:ligatures w14:val="none"/>
-        </w:rPr>
-      </w:pPr>
-    </w:p>
-    <w:p>
-      <w:pPr>
-        <w:autoSpaceDE w:val="0"/>
-        <w:autoSpaceDN w:val="0"/>
-        <w:adjustRightInd w:val="0"/>
-        <w:spacing w:after="0" w:line="240" w:lineRule="auto"/>
-        <w:ind w:left="708" w:right="-574" w:firstLine="708"/>
-        <w:rPr>
-          <w:rFonts w:ascii="Calibri" w:eastAsia="Times New Roman" w:hAnsi="Calibri" w:cs="Calibri"/>
-          <w:noProof/>
-          <w:kern w:val="0"/>
-          <w:sz w:val="22"/>
-          <w:lang w:eastAsia="de-DE"/>
-          <w14:ligatures w14:val="none"/>
-        </w:rPr>
-      </w:pPr>
-    </w:p>
-    <w:p>
-      <w:pPr>
-        <w:autoSpaceDE w:val="0"/>
-        <w:autoSpaceDN w:val="0"/>
-        <w:adjustRightInd w:val="0"/>
-        <w:spacing w:after="0" w:line="240" w:lineRule="auto"/>
-        <w:ind w:left="708" w:right="-574" w:firstLine="708"/>
+        <w:spacing w:after="0" w:line="360" w:lineRule="auto"/>
+        <w:ind w:right="-574"/>
+        <w:rPr>
+          <w:rFonts w:ascii="Arial" w:eastAsia="Times New Roman" w:hAnsi="Arial" w:cs="Calibri"/>
+          <w:noProof/>
+          <w:kern w:val="0"/>
+          <w:lang w:eastAsia="de-DE"/>
+          <w14:ligatures w14:val="none"/>
+        </w:rPr>
+      </w:pPr>
+    </w:p>
+    <w:p>
+      <w:pPr>
+        <w:autoSpaceDE w:val="0"/>
+        <w:autoSpaceDN w:val="0"/>
+        <w:adjustRightInd w:val="0"/>
+        <w:spacing w:after="0" w:line="360" w:lineRule="auto"/>
+        <w:ind w:right="-574"/>
+        <w:jc w:val="center"/>
         <w:rPr>
           <w:rFonts w:ascii="Arial" w:eastAsia="Times New Roman" w:hAnsi="Arial" w:cs="Arial"/>
           <w:noProof/>
           <w:kern w:val="0"/>
-          <w:sz w:val="18"/>
-          <w:szCs w:val="18"/>
+          <w:lang w:eastAsia="de-DE"/>
+          <w14:ligatures w14:val="none"/>
+        </w:rPr>
+      </w:pPr>
+    </w:p>
+    <w:p>
+      <w:pPr>
+        <w:tabs>
+          <w:tab w:val="left" w:pos="1418"/>
+          <w:tab w:val="left" w:pos="1843"/>
+        </w:tabs>
+        <w:autoSpaceDE w:val="0"/>
+        <w:autoSpaceDN w:val="0"/>
+        <w:adjustRightInd w:val="0"/>
+        <w:spacing w:after="0" w:line="360" w:lineRule="auto"/>
+        <w:ind w:right="-574"/>
+        <w:rPr>
+          <w:rFonts w:ascii="Arial" w:eastAsia="Times New Roman" w:hAnsi="Arial" w:cs="Calibri"/>
+          <w:noProof/>
+          <w:kern w:val="0"/>
           <w:lang w:eastAsia="de-DE"/>
           <w14:ligatures w14:val="none"/>
         </w:rPr>
       </w:pPr>
       <w:r>
         <w:rPr>
-          <w:rFonts w:ascii="Arial" w:eastAsia="Times New Roman" w:hAnsi="Arial" w:cs="Arial"/>
-          <w:noProof/>
-          <w:kern w:val="0"/>
-          <w:sz w:val="18"/>
-          <w:szCs w:val="18"/>
-          <w:lang w:eastAsia="de-DE"/>
-          <w14:ligatures w14:val="none"/>
-        </w:rPr>
-        <w:t xml:space="preserve">Dieses Dokument wurde automatisiert durch die VFA-Akademie erstellt. </w:t>
+          <w:rFonts w:ascii="Arial" w:eastAsia="Times New Roman" w:hAnsi="Arial" w:cs="Calibri"/>
+          <w:noProof/>
+          <w:kern w:val="0"/>
+          <w:lang w:eastAsia="de-DE"/>
+          <w14:ligatures w14:val="none"/>
+        </w:rPr>
+        <w:t xml:space="preserve">                </w:t>
       </w:r>
     </w:p>
     <w:p>
       <w:pPr>
-        <w:autoSpaceDE w:val="0"/>
-        <w:autoSpaceDN w:val="0"/>
-        <w:adjustRightInd w:val="0"/>
-        <w:spacing w:after="0" w:line="240" w:lineRule="auto"/>
-        <w:ind w:left="708" w:right="-574" w:firstLine="708"/>
+        <w:tabs>
+          <w:tab w:val="left" w:pos="1418"/>
+          <w:tab w:val="left" w:pos="1843"/>
+        </w:tabs>
+        <w:autoSpaceDE w:val="0"/>
+        <w:autoSpaceDN w:val="0"/>
+        <w:adjustRightInd w:val="0"/>
+        <w:spacing w:after="0" w:line="360" w:lineRule="auto"/>
+        <w:ind w:right="-574"/>
         <w:rPr>
           <w:rFonts w:ascii="Arial" w:eastAsia="Times New Roman" w:hAnsi="Arial" w:cs="Calibri"/>
           <w:noProof/>
@@ -930,36 +709,91 @@
           <w14:ligatures w14:val="none"/>
         </w:rPr>
       </w:pPr>
+    </w:p>
+    <w:p>
+      <w:pPr>
+        <w:tabs>
+          <w:tab w:val="left" w:pos="1418"/>
+          <w:tab w:val="left" w:pos="1843"/>
+        </w:tabs>
+        <w:autoSpaceDE w:val="0"/>
+        <w:autoSpaceDN w:val="0"/>
+        <w:adjustRightInd w:val="0"/>
+        <w:spacing w:after="0" w:line="360" w:lineRule="auto"/>
+        <w:ind w:right="-574"/>
+        <w:rPr>
+          <w:rFonts w:ascii="Arial" w:eastAsia="Times New Roman" w:hAnsi="Arial" w:cs="Calibri"/>
+          <w:noProof/>
+          <w:kern w:val="0"/>
+          <w:lang w:eastAsia="de-DE"/>
+          <w14:ligatures w14:val="none"/>
+        </w:rPr>
+      </w:pPr>
+    </w:p>
+    <w:p>
+      <w:pPr>
+        <w:tabs>
+          <w:tab w:val="left" w:pos="1418"/>
+          <w:tab w:val="left" w:pos="1843"/>
+        </w:tabs>
+        <w:autoSpaceDE w:val="0"/>
+        <w:autoSpaceDN w:val="0"/>
+        <w:adjustRightInd w:val="0"/>
+        <w:spacing w:after="0" w:line="360" w:lineRule="auto"/>
+        <w:ind w:right="-574"/>
+        <w:rPr>
+          <w:rFonts w:ascii="Arial" w:eastAsia="Times New Roman" w:hAnsi="Arial" w:cs="Calibri"/>
+          <w:noProof/>
+          <w:kern w:val="0"/>
+          <w:lang w:eastAsia="de-DE"/>
+          <w14:ligatures w14:val="none"/>
+        </w:rPr>
+      </w:pPr>
+    </w:p>
+    <w:p>
+      <w:pPr>
+        <w:tabs>
+          <w:tab w:val="left" w:pos="1418"/>
+          <w:tab w:val="left" w:pos="1843"/>
+        </w:tabs>
+        <w:autoSpaceDE w:val="0"/>
+        <w:autoSpaceDN w:val="0"/>
+        <w:adjustRightInd w:val="0"/>
+        <w:spacing w:after="0" w:line="360" w:lineRule="auto"/>
+        <w:ind w:right="-574"/>
+        <w:rPr>
+          <w:rFonts w:ascii="Arial" w:eastAsia="Times New Roman" w:hAnsi="Arial" w:cs="Calibri"/>
+          <w:noProof/>
+          <w:kern w:val="0"/>
+          <w:lang w:eastAsia="de-DE"/>
+          <w14:ligatures w14:val="none"/>
+        </w:rPr>
+      </w:pPr>
+    </w:p>
+    <w:p>
+      <w:pPr>
+        <w:tabs>
+          <w:tab w:val="left" w:pos="1418"/>
+          <w:tab w:val="left" w:pos="1843"/>
+        </w:tabs>
+        <w:autoSpaceDE w:val="0"/>
+        <w:autoSpaceDN w:val="0"/>
+        <w:adjustRightInd w:val="0"/>
+        <w:spacing w:after="0" w:line="360" w:lineRule="auto"/>
+        <w:ind w:right="-574"/>
+        <w:rPr>
+          <w:rFonts w:ascii="Arial" w:eastAsia="Times New Roman" w:hAnsi="Arial" w:cs="Calibri"/>
+          <w:noProof/>
+          <w:kern w:val="0"/>
+          <w:lang w:eastAsia="de-DE"/>
+          <w14:ligatures w14:val="none"/>
+        </w:rPr>
+      </w:pPr>
       <w:r>
         <w:rPr>
-          <w:rFonts w:ascii="Arial" w:eastAsia="Times New Roman" w:hAnsi="Arial" w:cs="Arial"/>
-          <w:noProof/>
-          <w:kern w:val="0"/>
-          <w:sz w:val="18"/>
-          <w:szCs w:val="18"/>
-          <w:lang w:eastAsia="de-DE"/>
-          <w14:ligatures w14:val="none"/>
-        </w:rPr>
-        <w:t>Die Echtheit kann über die VFA-Akademie-App geprüft werden.</w:t>
-      </w:r>
-      <w:r>
-        <w:rPr>
-          <w:rFonts w:ascii="Arial" w:eastAsia="Times New Roman" w:hAnsi="Arial" w:cs="Arial"/>
-          <w:noProof/>
-          <w:kern w:val="0"/>
-          <w:sz w:val="20"/>
-          <w:szCs w:val="18"/>
-          <w:lang w:eastAsia="de-DE"/>
-          <w14:ligatures w14:val="none"/>
-        </w:rPr>
-        <w:t xml:space="preserve">   </w:t>
-      </w:r>
-      <w:r>
-        <w:rPr>
           <w:rFonts w:ascii="Arial" w:eastAsia="Times New Roman" w:hAnsi="Arial" w:cs="Calibri"/>
-          <w:kern w:val="0"/>
-          <w:sz w:val="20"/>
-          <w:szCs w:val="18"/>
+          <w:noProof/>
+          <w:kern w:val="0"/>
           <w:lang w:eastAsia="de-DE"/>
           <w14:ligatures w14:val="none"/>
         </w:rPr>
@@ -967,15 +801,13 @@
       </w:r>
       <w:r>
         <w:rPr>
-          <w:rFonts w:ascii="Arial" w:eastAsia="Times New Roman" w:hAnsi="Arial" w:cs="Arial"/>
-          <w:noProof/>
-          <w:kern w:val="0"/>
-          <w:sz w:val="20"/>
-          <w:szCs w:val="18"/>
-          <w:lang w:eastAsia="de-DE"/>
-          <w14:ligatures w14:val="none"/>
-        </w:rPr>
-        <w:t xml:space="preserve">                                    </w:t>
+          <w:rFonts w:ascii="Arial" w:eastAsia="Times New Roman" w:hAnsi="Arial" w:cs="Calibri"/>
+          <w:noProof/>
+          <w:kern w:val="0"/>
+          <w:lang w:eastAsia="de-DE"/>
+          <w14:ligatures w14:val="none"/>
+        </w:rPr>
+        <w:t>Dieses Dokument wurde maschinell erstellt und ist ohne Unterschrift gültig.</w:t>
       </w:r>
       <w:r>
         <w:rPr>
@@ -2004,6 +1836,7 @@
   <w:style w:type="character" w:default="1" w:styleId="Absatz-Standardschriftart">
     <w:name w:val="Default Paragraph Font"/>
     <w:uiPriority w:val="1"/>
+    <w:semiHidden/>
     <w:unhideWhenUsed/>
   </w:style>
   <w:style w:type="table" w:default="1" w:styleId="NormaleTabelle">

</xml_diff>